<commit_message>
Gate Windows upgrades with verified snapshots
Require an offline recovery snapshot before replacing existing Windows app or persistent files, including app-only upgrades. Add snapshot review tools, installer artifact signing evidence, isolated installer/database checks, CI coverage, and updated recovery and upgrade guidance.
</commit_message>
<xml_diff>
--- a/docs/user-guides/windows/01-InstallOrUpgradeOrchidAppOnWindows.docx
+++ b/docs/user-guides/windows/01-InstallOrUpgradeOrchidAppOnWindows.docx
@@ -230,7 +230,7 @@
         <w:rPr>
           <w:b/>
         </w:rPr>
-        <w:t>Important: Do not upgrade OrchidApp by copying files over an older OrchidApp folder. Use the Windows installer. Keep a verified recovery copy before upgrading; not every app-only update automatically creates a backup.</w:t>
+        <w:t>Important: Use the Windows installer for upgrades. It creates a verified recovery snapshot before replacing an existing app, including app-only updates. Keep a separate off-computer backup.</w:t>
       </w:r>
       <w:r/>
       <w:proofErr w:type="spellStart"/>
@@ -396,6 +396,9 @@
       <w:proofErr w:type="spellEnd"/>
     </w:p>
     <w:p>
+      <w:pPr>
+        <w:keepNext/>
+      </w:pPr>
       <w:r>
         <w:t xml:space="preserve">Your </w:t>
       </w:r>
@@ -587,16 +590,12 @@
     </w:p>
     <w:p>
       <w:r>
-        <w:t xml:space="preserve">Close the browser tab and close the </w:t>
+        <w:t>Close the browser tab and launcher; keep OrchidApp closed until setup finishes. If setup stops, preserve its message and recovery files; do not delete them to force installation.</w:t>
       </w:r>
       <w:proofErr w:type="spellStart"/>
-      <w:r>
-        <w:t>OrchidApp</w:t>
-      </w:r>
+      <w:r/>
       <w:proofErr w:type="spellEnd"/>
-      <w:r>
-        <w:t xml:space="preserve"> Launcher window.</w:t>
-      </w:r>
+      <w:r/>
     </w:p>
     <w:p>
       <w:r>

</xml_diff>

<commit_message>
Gate Windows upgrades with verified snapshots (#357)
* Gate Windows upgrades with verified snapshots

Require an offline recovery snapshot before replacing existing Windows app or persistent files, including app-only upgrades. Add snapshot review tools, installer artifact signing evidence, isolated installer/database checks, CI coverage, and updated recovery and upgrade guidance.

* Fix installer test compiler output handling

Send Inno compiler progress to the host stream so the test Build function returns only the executable path, and fail clearly if compilation does not produce the expected installer. Update the changelog with the correction and validation details.
</commit_message>
<xml_diff>
--- a/docs/user-guides/windows/01-InstallOrUpgradeOrchidAppOnWindows.docx
+++ b/docs/user-guides/windows/01-InstallOrUpgradeOrchidAppOnWindows.docx
@@ -230,7 +230,7 @@
         <w:rPr>
           <w:b/>
         </w:rPr>
-        <w:t>Important: Do not upgrade OrchidApp by copying files over an older OrchidApp folder. Use the Windows installer. Keep a verified recovery copy before upgrading; not every app-only update automatically creates a backup.</w:t>
+        <w:t>Important: Use the Windows installer for upgrades. It creates a verified recovery snapshot before replacing an existing app, including app-only updates. Keep a separate off-computer backup.</w:t>
       </w:r>
       <w:r/>
       <w:proofErr w:type="spellStart"/>
@@ -396,6 +396,9 @@
       <w:proofErr w:type="spellEnd"/>
     </w:p>
     <w:p>
+      <w:pPr>
+        <w:keepNext/>
+      </w:pPr>
       <w:r>
         <w:t xml:space="preserve">Your </w:t>
       </w:r>
@@ -587,16 +590,12 @@
     </w:p>
     <w:p>
       <w:r>
-        <w:t xml:space="preserve">Close the browser tab and close the </w:t>
+        <w:t>Close the browser tab and launcher; keep OrchidApp closed until setup finishes. If setup stops, preserve its message and recovery files; do not delete them to force installation.</w:t>
       </w:r>
       <w:proofErr w:type="spellStart"/>
-      <w:r>
-        <w:t>OrchidApp</w:t>
-      </w:r>
+      <w:r/>
       <w:proofErr w:type="spellEnd"/>
-      <w:r>
-        <w:t xml:space="preserve"> Launcher window.</w:t>
-      </w:r>
+      <w:r/>
     </w:p>
     <w:p>
       <w:r>

</xml_diff>

<commit_message>
Prepare 1.4.0 release and refresh Windows guide
Bumps the product version to 1.4.0 and updates the Windows installation guide with SmartScreen screenshots.
</commit_message>
<xml_diff>
--- a/docs/user-guides/windows/01-InstallOrUpgradeOrchidAppOnWindows.docx
+++ b/docs/user-guides/windows/01-InstallOrUpgradeOrchidAppOnWindows.docx
@@ -124,10 +124,6 @@
         <w:pStyle w:val="Heading2"/>
       </w:pPr>
       <w:r>
-        <w:rPr>
-          <w:color w:val="000000"/>
-          <w:u w:val="none"/>
-        </w:rPr>
         <w:t>Before you start</w:t>
       </w:r>
     </w:p>
@@ -138,10 +134,6 @@
       <w:r>
         <w:t>Download the installer from the trusted release source. Before upgrading, create and preserve a verified backup away from the installed app.</w:t>
       </w:r>
-      <w:proofErr w:type="spellStart"/>
-      <w:r/>
-      <w:proofErr w:type="spellEnd"/>
-      <w:r/>
     </w:p>
     <w:p>
       <w:pPr>
@@ -150,14 +142,6 @@
       <w:r>
         <w:t>The installer is named OrchidAppSetup-&lt;version&gt;.exe. Check its version against the intended release.</w:t>
       </w:r>
-      <w:r>
-        <w:rPr>
-          <w:rFonts w:ascii="Consolas" w:eastAsia="Consolas" w:hAnsi="Consolas"/>
-          <w:color w:val="404040"/>
-          <w:sz w:val="18"/>
-        </w:rPr>
-      </w:r>
-      <w:r/>
     </w:p>
     <w:p>
       <w:pPr>
@@ -232,71 +216,46 @@
         </w:rPr>
         <w:t>Important: Use the Windows installer for upgrades. It creates a verified recovery snapshot before replacing an existing app, including app-only updates. Keep a separate off-computer backup.</w:t>
       </w:r>
-      <w:r/>
+    </w:p>
+    <w:p>
+      <w:pPr>
+        <w:pStyle w:val="Heading2"/>
+      </w:pPr>
+      <w:r>
+        <w:t>If this is a new install</w:t>
+      </w:r>
+    </w:p>
+    <w:p>
+      <w:r>
+        <w:t xml:space="preserve">A new install is when </w:t>
+      </w:r>
       <w:proofErr w:type="spellStart"/>
-      <w:r/>
+      <w:r>
+        <w:t>OrchidApp</w:t>
+      </w:r>
       <w:proofErr w:type="spellEnd"/>
-      <w:r/>
+      <w:r>
+        <w:t xml:space="preserve"> has not been installed on this computer before.</w:t>
+      </w:r>
+    </w:p>
+    <w:p>
+      <w:r>
+        <w:t xml:space="preserve">The installer will install the application files. When </w:t>
+      </w:r>
       <w:proofErr w:type="spellStart"/>
-      <w:r/>
+      <w:r>
+        <w:t>OrchidApp</w:t>
+      </w:r>
       <w:proofErr w:type="spellEnd"/>
-      <w:r/>
-      <w:proofErr w:type="spellStart"/>
-      <w:r/>
-      <w:proofErr w:type="spellEnd"/>
-      <w:r/>
-      <w:proofErr w:type="gramStart"/>
-      <w:r/>
-      <w:proofErr w:type="gramEnd"/>
-      <w:r/>
+      <w:r>
+        <w:t xml:space="preserve"> is opened for the first time, the launcher will prepare the local database and supporting folders automatically.</w:t>
+      </w:r>
     </w:p>
     <w:p>
       <w:pPr>
         <w:pStyle w:val="Heading2"/>
       </w:pPr>
       <w:r>
-        <w:rPr>
-          <w:color w:val="000000"/>
-          <w:u w:val="none"/>
-        </w:rPr>
-        <w:t>If this is a new install</w:t>
-      </w:r>
-    </w:p>
-    <w:p>
-      <w:r>
-        <w:t xml:space="preserve">A new install is when </w:t>
-      </w:r>
-      <w:proofErr w:type="spellStart"/>
-      <w:r>
-        <w:t>OrchidApp</w:t>
-      </w:r>
-      <w:proofErr w:type="spellEnd"/>
-      <w:r>
-        <w:t xml:space="preserve"> has not been installed on this computer before.</w:t>
-      </w:r>
-    </w:p>
-    <w:p>
-      <w:r>
-        <w:t xml:space="preserve">The installer will install the application files. When </w:t>
-      </w:r>
-      <w:proofErr w:type="spellStart"/>
-      <w:r>
-        <w:t>OrchidApp</w:t>
-      </w:r>
-      <w:proofErr w:type="spellEnd"/>
-      <w:r>
-        <w:t xml:space="preserve"> is opened for the first time, the launcher will prepare the local database and supporting folders automatically.</w:t>
-      </w:r>
-    </w:p>
-    <w:p>
-      <w:pPr>
-        <w:pStyle w:val="Heading2"/>
-      </w:pPr>
-      <w:r>
-        <w:rPr>
-          <w:color w:val="000000"/>
-          <w:u w:val="none"/>
-        </w:rPr>
         <w:t>If this is an upgrade</w:t>
       </w:r>
     </w:p>
@@ -365,10 +324,6 @@
         <w:pStyle w:val="Heading2"/>
       </w:pPr>
       <w:r>
-        <w:rPr>
-          <w:color w:val="000000"/>
-          <w:u w:val="none"/>
-        </w:rPr>
         <w:t>What the installer does</w:t>
       </w:r>
     </w:p>
@@ -376,10 +331,6 @@
       <w:r>
         <w:t>The installer uses this default application location (a selected location can differ):</w:t>
       </w:r>
-      <w:proofErr w:type="spellStart"/>
-      <w:r/>
-      <w:proofErr w:type="spellEnd"/>
-      <w:r/>
     </w:p>
     <w:p>
       <w:pPr>
@@ -400,6 +351,7 @@
         <w:keepNext/>
       </w:pPr>
       <w:r>
+        <w:lastRenderedPageBreak/>
         <w:t xml:space="preserve">Your </w:t>
       </w:r>
       <w:proofErr w:type="spellStart"/>
@@ -422,7 +374,6 @@
     </w:p>
     <w:p>
       <w:r>
-        <w:lastRenderedPageBreak/>
         <w:t>This means your plant database, uploaded photos, backups, settings and logs are not stored inside the application folder.</w:t>
       </w:r>
     </w:p>
@@ -444,26 +395,14 @@
         <w:pStyle w:val="Heading1"/>
       </w:pPr>
       <w:r>
-        <w:rPr>
-          <w:color w:val="000000"/>
-          <w:u w:val="none"/>
-        </w:rPr>
         <w:t xml:space="preserve">1. Find the </w:t>
       </w:r>
       <w:proofErr w:type="spellStart"/>
       <w:r>
-        <w:rPr>
-          <w:color w:val="000000"/>
-          <w:u w:val="none"/>
-        </w:rPr>
         <w:t>OrchidApp</w:t>
       </w:r>
       <w:proofErr w:type="spellEnd"/>
       <w:r>
-        <w:rPr>
-          <w:color w:val="000000"/>
-          <w:u w:val="none"/>
-        </w:rPr>
         <w:t xml:space="preserve"> installer</w:t>
       </w:r>
     </w:p>
@@ -491,15 +430,7 @@
         <w:t>Downloads</w:t>
       </w:r>
       <w:r>
-        <w:t xml:space="preserve"> folder unless you </w:t>
-      </w:r>
-      <w:proofErr w:type="gramStart"/>
-      <w:r>
-        <w:t>copied</w:t>
-      </w:r>
-      <w:proofErr w:type="gramEnd"/>
-      <w:r>
-        <w:t xml:space="preserve"> it somewhere else.</w:t>
+        <w:t xml:space="preserve"> folder unless you copied it somewhere else.</w:t>
       </w:r>
     </w:p>
     <w:p>
@@ -552,26 +483,14 @@
         <w:pStyle w:val="Heading1"/>
       </w:pPr>
       <w:r>
-        <w:rPr>
-          <w:color w:val="000000"/>
-          <w:u w:val="none"/>
-        </w:rPr>
         <w:t xml:space="preserve">2. Close </w:t>
       </w:r>
       <w:proofErr w:type="spellStart"/>
       <w:r>
-        <w:rPr>
-          <w:color w:val="000000"/>
-          <w:u w:val="none"/>
-        </w:rPr>
         <w:t>OrchidApp</w:t>
       </w:r>
       <w:proofErr w:type="spellEnd"/>
       <w:r>
-        <w:rPr>
-          <w:color w:val="000000"/>
-          <w:u w:val="none"/>
-        </w:rPr>
         <w:t xml:space="preserve"> if it is already running</w:t>
       </w:r>
     </w:p>
@@ -592,10 +511,6 @@
       <w:r>
         <w:t>Close the browser tab and launcher; keep OrchidApp closed until setup finishes. If setup stops, preserve its message and recovery files; do not delete them to force installation.</w:t>
       </w:r>
-      <w:proofErr w:type="spellStart"/>
-      <w:r/>
-      <w:proofErr w:type="spellEnd"/>
-      <w:r/>
     </w:p>
     <w:p>
       <w:r>
@@ -653,10 +568,6 @@
         <w:pStyle w:val="Heading1"/>
       </w:pPr>
       <w:r>
-        <w:rPr>
-          <w:color w:val="000000"/>
-          <w:u w:val="none"/>
-        </w:rPr>
         <w:t>3. Start the installer</w:t>
       </w:r>
     </w:p>
@@ -787,17 +698,41 @@
         <w:pStyle w:val="Heading1"/>
       </w:pPr>
       <w:r>
-        <w:rPr>
-          <w:color w:val="000000"/>
-          <w:u w:val="none"/>
-        </w:rPr>
         <w:lastRenderedPageBreak/>
-        <w:t>4. If Windows shows an unknown publisher warning</w:t>
-      </w:r>
-    </w:p>
-    <w:p>
-      <w:r>
-        <w:t>Windows may warn that the publisher is unknown.</w:t>
+        <w:t xml:space="preserve">4. Windows shows </w:t>
+      </w:r>
+      <w:r>
+        <w:t>a</w:t>
+      </w:r>
+      <w:r>
+        <w:t xml:space="preserve"> warning</w:t>
+      </w:r>
+    </w:p>
+    <w:p>
+      <w:r>
+        <w:t xml:space="preserve">Windows may </w:t>
+      </w:r>
+      <w:r>
+        <w:t>display 1 or 2 different warnings depending on how your PC is configured.</w:t>
+      </w:r>
+    </w:p>
+    <w:p>
+      <w:pPr>
+        <w:pStyle w:val="Heading2"/>
+      </w:pPr>
+      <w:r>
+        <w:t>User Account Control</w:t>
+      </w:r>
+    </w:p>
+    <w:p>
+      <w:r>
+        <w:t>It may warn</w:t>
+      </w:r>
+      <w:r>
+        <w:t xml:space="preserve"> that the publisher is unknown</w:t>
+      </w:r>
+      <w:r>
+        <w:t>.</w:t>
       </w:r>
     </w:p>
     <w:p>
@@ -815,15 +750,7 @@
     </w:p>
     <w:p>
       <w:r>
-        <w:t xml:space="preserve">Choose to continue only if the installer </w:t>
-      </w:r>
-      <w:proofErr w:type="gramStart"/>
-      <w:r>
-        <w:t>came</w:t>
-      </w:r>
-      <w:proofErr w:type="gramEnd"/>
-      <w:r>
-        <w:t xml:space="preserve"> from the trusted </w:t>
+        <w:t xml:space="preserve">Choose to continue only if the installer came from the trusted </w:t>
       </w:r>
       <w:proofErr w:type="spellStart"/>
       <w:r>
@@ -847,19 +774,11 @@
       <w:r>
         <w:t xml:space="preserve">, then </w:t>
       </w:r>
-      <w:proofErr w:type="gramStart"/>
       <w:r>
         <w:rPr>
           <w:b/>
         </w:rPr>
-        <w:t>Run</w:t>
-      </w:r>
-      <w:proofErr w:type="gramEnd"/>
-      <w:r>
-        <w:rPr>
-          <w:b/>
-        </w:rPr>
-        <w:t xml:space="preserve"> anyway</w:t>
+        <w:t>Run anyway</w:t>
       </w:r>
       <w:r>
         <w:t>.</w:t>
@@ -944,29 +863,183 @@
     </w:p>
     <w:p>
       <w:pPr>
+        <w:jc w:val="center"/>
+        <w:rPr>
+          <w:noProof/>
+        </w:rPr>
+      </w:pPr>
+    </w:p>
+    <w:p>
+      <w:pPr>
+        <w:pStyle w:val="Heading2"/>
+      </w:pPr>
+      <w:r>
+        <w:t>Windows Defender SmartScreen</w:t>
+      </w:r>
+    </w:p>
+    <w:p>
+      <w:r>
+        <w:t xml:space="preserve">The Windows Defender SmartScreen may popup with the </w:t>
+      </w:r>
+      <w:r>
+        <w:rPr>
+          <w:b/>
+          <w:bCs/>
+        </w:rPr>
+        <w:t>Windows protected your PC</w:t>
+      </w:r>
+      <w:r>
+        <w:t xml:space="preserve"> display.</w:t>
+      </w:r>
+    </w:p>
+    <w:p>
+      <w:r>
+        <w:t xml:space="preserve">This can happen because </w:t>
+      </w:r>
+      <w:proofErr w:type="spellStart"/>
+      <w:r>
+        <w:t>OrchidApp</w:t>
+      </w:r>
+      <w:proofErr w:type="spellEnd"/>
+      <w:r>
+        <w:t xml:space="preserve"> is not code-signed.</w:t>
+      </w:r>
+    </w:p>
+    <w:p>
+      <w:r>
+        <w:t xml:space="preserve">Select the </w:t>
+      </w:r>
+      <w:r>
+        <w:rPr>
+          <w:b/>
+          <w:bCs/>
+          <w:u w:val="single"/>
+        </w:rPr>
+        <w:t>More info</w:t>
+      </w:r>
+      <w:r>
+        <w:t xml:space="preserve"> link. The App: will be named </w:t>
+      </w:r>
+      <w:r>
+        <w:rPr>
+          <w:b/>
+          <w:bCs/>
+        </w:rPr>
+        <w:t>OrchidAppSetup-….exe</w:t>
+      </w:r>
+      <w:r>
+        <w:t xml:space="preserve"> and it will be Unknown publisher. Select the </w:t>
+      </w:r>
+      <w:r>
+        <w:rPr>
+          <w:b/>
+          <w:bCs/>
+        </w:rPr>
+        <w:t>Run anyway</w:t>
+      </w:r>
+      <w:r>
+        <w:t xml:space="preserve"> button.</w:t>
+      </w:r>
+    </w:p>
+    <w:p>
+      <w:r>
+        <w:rPr>
+          <w:noProof/>
+        </w:rPr>
+        <w:lastRenderedPageBreak/>
+        <w:drawing>
+          <wp:inline distT="0" distB="0" distL="0" distR="0" wp14:anchorId="130EF8BD" wp14:editId="617CBAF4">
+            <wp:extent cx="3086100" cy="2853813"/>
+            <wp:effectExtent l="0" t="0" r="0" b="3810"/>
+            <wp:docPr id="1285984301" name="Picture 1"/>
+            <wp:cNvGraphicFramePr>
+              <a:graphicFrameLocks xmlns:a="http://schemas.openxmlformats.org/drawingml/2006/main" noChangeAspect="1"/>
+            </wp:cNvGraphicFramePr>
+            <a:graphic xmlns:a="http://schemas.openxmlformats.org/drawingml/2006/main">
+              <a:graphicData uri="http://schemas.openxmlformats.org/drawingml/2006/picture">
+                <pic:pic xmlns:pic="http://schemas.openxmlformats.org/drawingml/2006/picture">
+                  <pic:nvPicPr>
+                    <pic:cNvPr id="1285984301" name="Picture 1285984301"/>
+                    <pic:cNvPicPr/>
+                  </pic:nvPicPr>
+                  <pic:blipFill>
+                    <a:blip r:embed="rId12"/>
+                    <a:stretch>
+                      <a:fillRect/>
+                    </a:stretch>
+                  </pic:blipFill>
+                  <pic:spPr>
+                    <a:xfrm>
+                      <a:off x="0" y="0"/>
+                      <a:ext cx="3088676" cy="2856195"/>
+                    </a:xfrm>
+                    <a:prstGeom prst="rect">
+                      <a:avLst/>
+                    </a:prstGeom>
+                  </pic:spPr>
+                </pic:pic>
+              </a:graphicData>
+            </a:graphic>
+          </wp:inline>
+        </w:drawing>
+      </w:r>
+      <w:r>
+        <w:tab/>
+      </w:r>
+      <w:r>
+        <w:rPr>
+          <w:noProof/>
+        </w:rPr>
+        <w:drawing>
+          <wp:inline distT="0" distB="0" distL="0" distR="0" wp14:anchorId="184FDA05" wp14:editId="1BC5CD2E">
+            <wp:extent cx="3000375" cy="2848632"/>
+            <wp:effectExtent l="0" t="0" r="0" b="8890"/>
+            <wp:docPr id="1221703675" name="Picture 2"/>
+            <wp:cNvGraphicFramePr>
+              <a:graphicFrameLocks xmlns:a="http://schemas.openxmlformats.org/drawingml/2006/main" noChangeAspect="1"/>
+            </wp:cNvGraphicFramePr>
+            <a:graphic xmlns:a="http://schemas.openxmlformats.org/drawingml/2006/main">
+              <a:graphicData uri="http://schemas.openxmlformats.org/drawingml/2006/picture">
+                <pic:pic xmlns:pic="http://schemas.openxmlformats.org/drawingml/2006/picture">
+                  <pic:nvPicPr>
+                    <pic:cNvPr id="1221703675" name="Picture 1221703675"/>
+                    <pic:cNvPicPr/>
+                  </pic:nvPicPr>
+                  <pic:blipFill>
+                    <a:blip r:embed="rId13"/>
+                    <a:stretch>
+                      <a:fillRect/>
+                    </a:stretch>
+                  </pic:blipFill>
+                  <pic:spPr>
+                    <a:xfrm>
+                      <a:off x="0" y="0"/>
+                      <a:ext cx="3029454" cy="2876240"/>
+                    </a:xfrm>
+                    <a:prstGeom prst="rect">
+                      <a:avLst/>
+                    </a:prstGeom>
+                  </pic:spPr>
+                </pic:pic>
+              </a:graphicData>
+            </a:graphic>
+          </wp:inline>
+        </w:drawing>
+      </w:r>
+    </w:p>
+    <w:p>
+      <w:pPr>
         <w:pStyle w:val="Heading1"/>
       </w:pPr>
       <w:r>
-        <w:rPr>
-          <w:color w:val="000000"/>
-          <w:u w:val="none"/>
-        </w:rPr>
         <w:t xml:space="preserve">5. Follow the </w:t>
       </w:r>
       <w:proofErr w:type="spellStart"/>
       <w:r>
-        <w:rPr>
-          <w:color w:val="000000"/>
-          <w:u w:val="none"/>
-        </w:rPr>
         <w:t>OrchidApp</w:t>
       </w:r>
       <w:proofErr w:type="spellEnd"/>
       <w:r>
-        <w:rPr>
-          <w:color w:val="000000"/>
-          <w:u w:val="none"/>
-        </w:rPr>
         <w:t xml:space="preserve"> Setup Wizard</w:t>
       </w:r>
     </w:p>
@@ -1046,7 +1119,7 @@
                     <pic:cNvPicPr/>
                   </pic:nvPicPr>
                   <pic:blipFill>
-                    <a:blip r:embed="rId12"/>
+                    <a:blip r:embed="rId14"/>
                     <a:stretch>
                       <a:fillRect/>
                     </a:stretch>
@@ -1072,10 +1145,6 @@
         <w:pStyle w:val="Heading1"/>
       </w:pPr>
       <w:r>
-        <w:rPr>
-          <w:color w:val="000000"/>
-          <w:u w:val="none"/>
-        </w:rPr>
         <w:t>6. Choose shortcut options</w:t>
       </w:r>
     </w:p>
@@ -1152,7 +1221,7 @@
                     <pic:cNvPicPr/>
                   </pic:nvPicPr>
                   <pic:blipFill>
-                    <a:blip r:embed="rId13"/>
+                    <a:blip r:embed="rId15"/>
                     <a:stretch>
                       <a:fillRect/>
                     </a:stretch>
@@ -1178,18 +1247,10 @@
         <w:pStyle w:val="Heading1"/>
       </w:pPr>
       <w:r>
-        <w:rPr>
-          <w:color w:val="000000"/>
-          <w:u w:val="none"/>
-        </w:rPr>
         <w:t xml:space="preserve">7. Install or upgrade </w:t>
       </w:r>
       <w:proofErr w:type="spellStart"/>
       <w:r>
-        <w:rPr>
-          <w:color w:val="000000"/>
-          <w:u w:val="none"/>
-        </w:rPr>
         <w:t>OrchidApp</w:t>
       </w:r>
       <w:proofErr w:type="spellEnd"/>
@@ -1233,7 +1294,7 @@
                     <pic:cNvPicPr/>
                   </pic:nvPicPr>
                   <pic:blipFill>
-                    <a:blip r:embed="rId14"/>
+                    <a:blip r:embed="rId16"/>
                     <a:stretch>
                       <a:fillRect/>
                     </a:stretch>
@@ -1269,15 +1330,7 @@
     </w:p>
     <w:p>
       <w:r>
-        <w:t xml:space="preserve">For a new install, this </w:t>
-      </w:r>
-      <w:proofErr w:type="gramStart"/>
-      <w:r>
-        <w:t>installs</w:t>
-      </w:r>
-      <w:proofErr w:type="gramEnd"/>
-      <w:r>
-        <w:t xml:space="preserve"> </w:t>
+        <w:t xml:space="preserve">For a new install, this installs </w:t>
       </w:r>
       <w:proofErr w:type="spellStart"/>
       <w:r>
@@ -1326,7 +1379,7 @@
                     <pic:cNvPicPr/>
                   </pic:nvPicPr>
                   <pic:blipFill>
-                    <a:blip r:embed="rId15"/>
+                    <a:blip r:embed="rId17"/>
                     <a:stretch>
                       <a:fillRect/>
                     </a:stretch>
@@ -1352,10 +1405,6 @@
         <w:pStyle w:val="Heading1"/>
       </w:pPr>
       <w:r>
-        <w:rPr>
-          <w:color w:val="000000"/>
-          <w:u w:val="none"/>
-        </w:rPr>
         <w:t>8. Finish setup</w:t>
       </w:r>
     </w:p>
@@ -1420,7 +1469,7 @@
                     <pic:cNvPicPr/>
                   </pic:nvPicPr>
                   <pic:blipFill>
-                    <a:blip r:embed="rId16"/>
+                    <a:blip r:embed="rId18"/>
                     <a:stretch>
                       <a:fillRect/>
                     </a:stretch>
@@ -1446,19 +1495,11 @@
         <w:pStyle w:val="Heading1"/>
       </w:pPr>
       <w:r>
-        <w:rPr>
-          <w:color w:val="000000"/>
-          <w:u w:val="none"/>
-        </w:rPr>
         <w:lastRenderedPageBreak/>
         <w:t xml:space="preserve">9. Open </w:t>
       </w:r>
       <w:proofErr w:type="spellStart"/>
       <w:r>
-        <w:rPr>
-          <w:color w:val="000000"/>
-          <w:u w:val="none"/>
-        </w:rPr>
         <w:t>OrchidApp</w:t>
       </w:r>
       <w:proofErr w:type="spellEnd"/>
@@ -1493,10 +1534,6 @@
       <w:r>
         <w:t>On first use, the launcher prepares the database and checks photo storage and image processing before opening the app. Keep any reported recovery files and contact support if these checks fail.</w:t>
       </w:r>
-      <w:proofErr w:type="spellStart"/>
-      <w:r/>
-      <w:proofErr w:type="spellEnd"/>
-      <w:r/>
     </w:p>
     <w:p>
       <w:r>
@@ -1585,7 +1622,7 @@
                     <pic:cNvPicPr/>
                   </pic:nvPicPr>
                   <pic:blipFill>
-                    <a:blip r:embed="rId17"/>
+                    <a:blip r:embed="rId19"/>
                     <a:stretch>
                       <a:fillRect/>
                     </a:stretch>
@@ -1611,26 +1648,14 @@
         <w:pStyle w:val="Heading1"/>
       </w:pPr>
       <w:r>
-        <w:rPr>
-          <w:color w:val="000000"/>
-          <w:u w:val="none"/>
-        </w:rPr>
         <w:t xml:space="preserve">10. Check </w:t>
       </w:r>
       <w:proofErr w:type="spellStart"/>
       <w:r>
-        <w:rPr>
-          <w:color w:val="000000"/>
-          <w:u w:val="none"/>
-        </w:rPr>
         <w:t>OrchidApp</w:t>
       </w:r>
       <w:proofErr w:type="spellEnd"/>
       <w:r>
-        <w:rPr>
-          <w:color w:val="000000"/>
-          <w:u w:val="none"/>
-        </w:rPr>
         <w:t xml:space="preserve"> opens correctly</w:t>
       </w:r>
     </w:p>
@@ -1704,7 +1729,7 @@
                     <pic:cNvPicPr/>
                   </pic:nvPicPr>
                   <pic:blipFill>
-                    <a:blip r:embed="rId18"/>
+                    <a:blip r:embed="rId20"/>
                     <a:stretch>
                       <a:fillRect/>
                     </a:stretch>
@@ -1731,17 +1756,9 @@
         <w:pStyle w:val="Heading1"/>
       </w:pPr>
       <w:r>
-        <w:rPr>
-          <w:color w:val="000000"/>
-          <w:u w:val="none"/>
-        </w:rPr>
         <w:t xml:space="preserve">11. </w:t>
       </w:r>
       <w:r>
-        <w:rPr>
-          <w:color w:val="000000"/>
-          <w:u w:val="none"/>
-        </w:rPr>
         <w:t>Installation or upgrade complete</w:t>
       </w:r>
     </w:p>
@@ -1839,10 +1856,6 @@
         <w:pStyle w:val="Heading1"/>
       </w:pPr>
       <w:r>
-        <w:rPr>
-          <w:color w:val="000000"/>
-          <w:u w:val="none"/>
-        </w:rPr>
         <w:t>After installing or upgrading</w:t>
       </w:r>
     </w:p>
@@ -1969,10 +1982,6 @@
         <w:pStyle w:val="Heading1"/>
       </w:pPr>
       <w:r>
-        <w:rPr>
-          <w:color w:val="000000"/>
-          <w:u w:val="none"/>
-        </w:rPr>
         <w:t>First-use performance note</w:t>
       </w:r>
     </w:p>
@@ -2035,10 +2044,6 @@
         <w:pStyle w:val="Heading1"/>
       </w:pPr>
       <w:r>
-        <w:rPr>
-          <w:color w:val="000000"/>
-          <w:u w:val="none"/>
-        </w:rPr>
         <w:t>Important upgrade notes</w:t>
       </w:r>
     </w:p>
@@ -2144,18 +2149,10 @@
         <w:pStyle w:val="Heading1"/>
       </w:pPr>
       <w:r>
-        <w:rPr>
-          <w:color w:val="000000"/>
-          <w:u w:val="none"/>
-        </w:rPr>
         <w:t xml:space="preserve">Uninstalling </w:t>
       </w:r>
       <w:proofErr w:type="spellStart"/>
       <w:r>
-        <w:rPr>
-          <w:color w:val="000000"/>
-          <w:u w:val="none"/>
-        </w:rPr>
         <w:t>OrchidApp</w:t>
       </w:r>
       <w:proofErr w:type="spellEnd"/>
@@ -2296,10 +2293,6 @@
         <w:pStyle w:val="Heading1"/>
       </w:pPr>
       <w:r>
-        <w:rPr>
-          <w:color w:val="000000"/>
-          <w:u w:val="none"/>
-        </w:rPr>
         <w:t>Getting support</w:t>
       </w:r>
     </w:p>
@@ -2333,13 +2326,8 @@
       <w:pPr>
         <w:pStyle w:val="ListBullet"/>
       </w:pPr>
-      <w:proofErr w:type="gramStart"/>
-      <w:r>
-        <w:t>what</w:t>
-      </w:r>
-      <w:proofErr w:type="gramEnd"/>
-      <w:r>
-        <w:t xml:space="preserve"> you were trying to do</w:t>
+      <w:r>
+        <w:t>what you were trying to do</w:t>
       </w:r>
     </w:p>
     <w:p>
@@ -2363,6 +2351,7 @@
         <w:pStyle w:val="ListBullet"/>
       </w:pPr>
       <w:r>
+        <w:lastRenderedPageBreak/>
         <w:t xml:space="preserve">any message shown by the </w:t>
       </w:r>
       <w:proofErr w:type="spellStart"/>
@@ -2384,7 +2373,6 @@
     </w:p>
     <w:p>
       <w:r>
-        <w:lastRenderedPageBreak/>
         <w:t>The launcher support log is stored at:</w:t>
       </w:r>
     </w:p>
@@ -2402,10 +2390,6 @@
         <w:pStyle w:val="Heading1"/>
       </w:pPr>
       <w:r>
-        <w:rPr>
-          <w:color w:val="000000"/>
-          <w:u w:val="none"/>
-        </w:rPr>
         <w:t>Troubleshooting</w:t>
       </w:r>
     </w:p>
@@ -2522,19 +2506,11 @@
             <w:r>
               <w:t xml:space="preserve">, then </w:t>
             </w:r>
-            <w:proofErr w:type="gramStart"/>
             <w:r>
               <w:rPr>
                 <w:b/>
               </w:rPr>
-              <w:t>Run</w:t>
-            </w:r>
-            <w:proofErr w:type="gramEnd"/>
-            <w:r>
-              <w:rPr>
-                <w:b/>
-              </w:rPr>
-              <w:t xml:space="preserve"> anyway</w:t>
+              <w:t>Run anyway</w:t>
             </w:r>
             <w:r>
               <w:t>, only if you trust the installer.</w:t>
@@ -2822,12 +2798,12 @@
     </w:tbl>
     <w:p/>
     <w:sectPr>
-      <w:headerReference w:type="even" r:id="rId19"/>
-      <w:headerReference w:type="default" r:id="rId20"/>
-      <w:footerReference w:type="even" r:id="rId21"/>
-      <w:footerReference w:type="default" r:id="rId22"/>
-      <w:headerReference w:type="first" r:id="rId23"/>
-      <w:footerReference w:type="first" r:id="rId24"/>
+      <w:headerReference w:type="even" r:id="rId21"/>
+      <w:headerReference w:type="default" r:id="rId22"/>
+      <w:footerReference w:type="even" r:id="rId23"/>
+      <w:footerReference w:type="default" r:id="rId24"/>
+      <w:headerReference w:type="first" r:id="rId25"/>
+      <w:footerReference w:type="first" r:id="rId26"/>
       <w:pgSz w:w="12240" w:h="15840"/>
       <w:pgMar w:top="936" w:right="1008" w:bottom="936" w:left="1008" w:header="720" w:footer="720" w:gutter="0"/>
       <w:cols w:space="720"/>
@@ -3628,7 +3604,7 @@
   <w:style w:type="paragraph" w:default="1" w:styleId="Normal">
     <w:name w:val="Normal"/>
     <w:qFormat/>
-    <w:rsid w:val="00FC693F"/>
+    <w:rsid w:val="00517174"/>
     <w:pPr>
       <w:spacing w:after="120" w:line="259" w:lineRule="auto"/>
     </w:pPr>

</xml_diff>

<commit_message>
Prepare 1.4.0 release and refresh Windows guide (#366)
Bumps the product version to 1.4.0 and updates the Windows installation guide with SmartScreen screenshots.
</commit_message>
<xml_diff>
--- a/docs/user-guides/windows/01-InstallOrUpgradeOrchidAppOnWindows.docx
+++ b/docs/user-guides/windows/01-InstallOrUpgradeOrchidAppOnWindows.docx
@@ -124,10 +124,6 @@
         <w:pStyle w:val="Heading2"/>
       </w:pPr>
       <w:r>
-        <w:rPr>
-          <w:color w:val="000000"/>
-          <w:u w:val="none"/>
-        </w:rPr>
         <w:t>Before you start</w:t>
       </w:r>
     </w:p>
@@ -138,10 +134,6 @@
       <w:r>
         <w:t>Download the installer from the trusted release source. Before upgrading, create and preserve a verified backup away from the installed app.</w:t>
       </w:r>
-      <w:proofErr w:type="spellStart"/>
-      <w:r/>
-      <w:proofErr w:type="spellEnd"/>
-      <w:r/>
     </w:p>
     <w:p>
       <w:pPr>
@@ -150,14 +142,6 @@
       <w:r>
         <w:t>The installer is named OrchidAppSetup-&lt;version&gt;.exe. Check its version against the intended release.</w:t>
       </w:r>
-      <w:r>
-        <w:rPr>
-          <w:rFonts w:ascii="Consolas" w:eastAsia="Consolas" w:hAnsi="Consolas"/>
-          <w:color w:val="404040"/>
-          <w:sz w:val="18"/>
-        </w:rPr>
-      </w:r>
-      <w:r/>
     </w:p>
     <w:p>
       <w:pPr>
@@ -232,71 +216,46 @@
         </w:rPr>
         <w:t>Important: Use the Windows installer for upgrades. It creates a verified recovery snapshot before replacing an existing app, including app-only updates. Keep a separate off-computer backup.</w:t>
       </w:r>
-      <w:r/>
+    </w:p>
+    <w:p>
+      <w:pPr>
+        <w:pStyle w:val="Heading2"/>
+      </w:pPr>
+      <w:r>
+        <w:t>If this is a new install</w:t>
+      </w:r>
+    </w:p>
+    <w:p>
+      <w:r>
+        <w:t xml:space="preserve">A new install is when </w:t>
+      </w:r>
       <w:proofErr w:type="spellStart"/>
-      <w:r/>
+      <w:r>
+        <w:t>OrchidApp</w:t>
+      </w:r>
       <w:proofErr w:type="spellEnd"/>
-      <w:r/>
+      <w:r>
+        <w:t xml:space="preserve"> has not been installed on this computer before.</w:t>
+      </w:r>
+    </w:p>
+    <w:p>
+      <w:r>
+        <w:t xml:space="preserve">The installer will install the application files. When </w:t>
+      </w:r>
       <w:proofErr w:type="spellStart"/>
-      <w:r/>
+      <w:r>
+        <w:t>OrchidApp</w:t>
+      </w:r>
       <w:proofErr w:type="spellEnd"/>
-      <w:r/>
-      <w:proofErr w:type="spellStart"/>
-      <w:r/>
-      <w:proofErr w:type="spellEnd"/>
-      <w:r/>
-      <w:proofErr w:type="gramStart"/>
-      <w:r/>
-      <w:proofErr w:type="gramEnd"/>
-      <w:r/>
+      <w:r>
+        <w:t xml:space="preserve"> is opened for the first time, the launcher will prepare the local database and supporting folders automatically.</w:t>
+      </w:r>
     </w:p>
     <w:p>
       <w:pPr>
         <w:pStyle w:val="Heading2"/>
       </w:pPr>
       <w:r>
-        <w:rPr>
-          <w:color w:val="000000"/>
-          <w:u w:val="none"/>
-        </w:rPr>
-        <w:t>If this is a new install</w:t>
-      </w:r>
-    </w:p>
-    <w:p>
-      <w:r>
-        <w:t xml:space="preserve">A new install is when </w:t>
-      </w:r>
-      <w:proofErr w:type="spellStart"/>
-      <w:r>
-        <w:t>OrchidApp</w:t>
-      </w:r>
-      <w:proofErr w:type="spellEnd"/>
-      <w:r>
-        <w:t xml:space="preserve"> has not been installed on this computer before.</w:t>
-      </w:r>
-    </w:p>
-    <w:p>
-      <w:r>
-        <w:t xml:space="preserve">The installer will install the application files. When </w:t>
-      </w:r>
-      <w:proofErr w:type="spellStart"/>
-      <w:r>
-        <w:t>OrchidApp</w:t>
-      </w:r>
-      <w:proofErr w:type="spellEnd"/>
-      <w:r>
-        <w:t xml:space="preserve"> is opened for the first time, the launcher will prepare the local database and supporting folders automatically.</w:t>
-      </w:r>
-    </w:p>
-    <w:p>
-      <w:pPr>
-        <w:pStyle w:val="Heading2"/>
-      </w:pPr>
-      <w:r>
-        <w:rPr>
-          <w:color w:val="000000"/>
-          <w:u w:val="none"/>
-        </w:rPr>
         <w:t>If this is an upgrade</w:t>
       </w:r>
     </w:p>
@@ -365,10 +324,6 @@
         <w:pStyle w:val="Heading2"/>
       </w:pPr>
       <w:r>
-        <w:rPr>
-          <w:color w:val="000000"/>
-          <w:u w:val="none"/>
-        </w:rPr>
         <w:t>What the installer does</w:t>
       </w:r>
     </w:p>
@@ -376,10 +331,6 @@
       <w:r>
         <w:t>The installer uses this default application location (a selected location can differ):</w:t>
       </w:r>
-      <w:proofErr w:type="spellStart"/>
-      <w:r/>
-      <w:proofErr w:type="spellEnd"/>
-      <w:r/>
     </w:p>
     <w:p>
       <w:pPr>
@@ -400,6 +351,7 @@
         <w:keepNext/>
       </w:pPr>
       <w:r>
+        <w:lastRenderedPageBreak/>
         <w:t xml:space="preserve">Your </w:t>
       </w:r>
       <w:proofErr w:type="spellStart"/>
@@ -422,7 +374,6 @@
     </w:p>
     <w:p>
       <w:r>
-        <w:lastRenderedPageBreak/>
         <w:t>This means your plant database, uploaded photos, backups, settings and logs are not stored inside the application folder.</w:t>
       </w:r>
     </w:p>
@@ -444,26 +395,14 @@
         <w:pStyle w:val="Heading1"/>
       </w:pPr>
       <w:r>
-        <w:rPr>
-          <w:color w:val="000000"/>
-          <w:u w:val="none"/>
-        </w:rPr>
         <w:t xml:space="preserve">1. Find the </w:t>
       </w:r>
       <w:proofErr w:type="spellStart"/>
       <w:r>
-        <w:rPr>
-          <w:color w:val="000000"/>
-          <w:u w:val="none"/>
-        </w:rPr>
         <w:t>OrchidApp</w:t>
       </w:r>
       <w:proofErr w:type="spellEnd"/>
       <w:r>
-        <w:rPr>
-          <w:color w:val="000000"/>
-          <w:u w:val="none"/>
-        </w:rPr>
         <w:t xml:space="preserve"> installer</w:t>
       </w:r>
     </w:p>
@@ -491,15 +430,7 @@
         <w:t>Downloads</w:t>
       </w:r>
       <w:r>
-        <w:t xml:space="preserve"> folder unless you </w:t>
-      </w:r>
-      <w:proofErr w:type="gramStart"/>
-      <w:r>
-        <w:t>copied</w:t>
-      </w:r>
-      <w:proofErr w:type="gramEnd"/>
-      <w:r>
-        <w:t xml:space="preserve"> it somewhere else.</w:t>
+        <w:t xml:space="preserve"> folder unless you copied it somewhere else.</w:t>
       </w:r>
     </w:p>
     <w:p>
@@ -552,26 +483,14 @@
         <w:pStyle w:val="Heading1"/>
       </w:pPr>
       <w:r>
-        <w:rPr>
-          <w:color w:val="000000"/>
-          <w:u w:val="none"/>
-        </w:rPr>
         <w:t xml:space="preserve">2. Close </w:t>
       </w:r>
       <w:proofErr w:type="spellStart"/>
       <w:r>
-        <w:rPr>
-          <w:color w:val="000000"/>
-          <w:u w:val="none"/>
-        </w:rPr>
         <w:t>OrchidApp</w:t>
       </w:r>
       <w:proofErr w:type="spellEnd"/>
       <w:r>
-        <w:rPr>
-          <w:color w:val="000000"/>
-          <w:u w:val="none"/>
-        </w:rPr>
         <w:t xml:space="preserve"> if it is already running</w:t>
       </w:r>
     </w:p>
@@ -592,10 +511,6 @@
       <w:r>
         <w:t>Close the browser tab and launcher; keep OrchidApp closed until setup finishes. If setup stops, preserve its message and recovery files; do not delete them to force installation.</w:t>
       </w:r>
-      <w:proofErr w:type="spellStart"/>
-      <w:r/>
-      <w:proofErr w:type="spellEnd"/>
-      <w:r/>
     </w:p>
     <w:p>
       <w:r>
@@ -653,10 +568,6 @@
         <w:pStyle w:val="Heading1"/>
       </w:pPr>
       <w:r>
-        <w:rPr>
-          <w:color w:val="000000"/>
-          <w:u w:val="none"/>
-        </w:rPr>
         <w:t>3. Start the installer</w:t>
       </w:r>
     </w:p>
@@ -787,17 +698,41 @@
         <w:pStyle w:val="Heading1"/>
       </w:pPr>
       <w:r>
-        <w:rPr>
-          <w:color w:val="000000"/>
-          <w:u w:val="none"/>
-        </w:rPr>
         <w:lastRenderedPageBreak/>
-        <w:t>4. If Windows shows an unknown publisher warning</w:t>
-      </w:r>
-    </w:p>
-    <w:p>
-      <w:r>
-        <w:t>Windows may warn that the publisher is unknown.</w:t>
+        <w:t xml:space="preserve">4. Windows shows </w:t>
+      </w:r>
+      <w:r>
+        <w:t>a</w:t>
+      </w:r>
+      <w:r>
+        <w:t xml:space="preserve"> warning</w:t>
+      </w:r>
+    </w:p>
+    <w:p>
+      <w:r>
+        <w:t xml:space="preserve">Windows may </w:t>
+      </w:r>
+      <w:r>
+        <w:t>display 1 or 2 different warnings depending on how your PC is configured.</w:t>
+      </w:r>
+    </w:p>
+    <w:p>
+      <w:pPr>
+        <w:pStyle w:val="Heading2"/>
+      </w:pPr>
+      <w:r>
+        <w:t>User Account Control</w:t>
+      </w:r>
+    </w:p>
+    <w:p>
+      <w:r>
+        <w:t>It may warn</w:t>
+      </w:r>
+      <w:r>
+        <w:t xml:space="preserve"> that the publisher is unknown</w:t>
+      </w:r>
+      <w:r>
+        <w:t>.</w:t>
       </w:r>
     </w:p>
     <w:p>
@@ -815,15 +750,7 @@
     </w:p>
     <w:p>
       <w:r>
-        <w:t xml:space="preserve">Choose to continue only if the installer </w:t>
-      </w:r>
-      <w:proofErr w:type="gramStart"/>
-      <w:r>
-        <w:t>came</w:t>
-      </w:r>
-      <w:proofErr w:type="gramEnd"/>
-      <w:r>
-        <w:t xml:space="preserve"> from the trusted </w:t>
+        <w:t xml:space="preserve">Choose to continue only if the installer came from the trusted </w:t>
       </w:r>
       <w:proofErr w:type="spellStart"/>
       <w:r>
@@ -847,19 +774,11 @@
       <w:r>
         <w:t xml:space="preserve">, then </w:t>
       </w:r>
-      <w:proofErr w:type="gramStart"/>
       <w:r>
         <w:rPr>
           <w:b/>
         </w:rPr>
-        <w:t>Run</w:t>
-      </w:r>
-      <w:proofErr w:type="gramEnd"/>
-      <w:r>
-        <w:rPr>
-          <w:b/>
-        </w:rPr>
-        <w:t xml:space="preserve"> anyway</w:t>
+        <w:t>Run anyway</w:t>
       </w:r>
       <w:r>
         <w:t>.</w:t>
@@ -944,29 +863,183 @@
     </w:p>
     <w:p>
       <w:pPr>
+        <w:jc w:val="center"/>
+        <w:rPr>
+          <w:noProof/>
+        </w:rPr>
+      </w:pPr>
+    </w:p>
+    <w:p>
+      <w:pPr>
+        <w:pStyle w:val="Heading2"/>
+      </w:pPr>
+      <w:r>
+        <w:t>Windows Defender SmartScreen</w:t>
+      </w:r>
+    </w:p>
+    <w:p>
+      <w:r>
+        <w:t xml:space="preserve">The Windows Defender SmartScreen may popup with the </w:t>
+      </w:r>
+      <w:r>
+        <w:rPr>
+          <w:b/>
+          <w:bCs/>
+        </w:rPr>
+        <w:t>Windows protected your PC</w:t>
+      </w:r>
+      <w:r>
+        <w:t xml:space="preserve"> display.</w:t>
+      </w:r>
+    </w:p>
+    <w:p>
+      <w:r>
+        <w:t xml:space="preserve">This can happen because </w:t>
+      </w:r>
+      <w:proofErr w:type="spellStart"/>
+      <w:r>
+        <w:t>OrchidApp</w:t>
+      </w:r>
+      <w:proofErr w:type="spellEnd"/>
+      <w:r>
+        <w:t xml:space="preserve"> is not code-signed.</w:t>
+      </w:r>
+    </w:p>
+    <w:p>
+      <w:r>
+        <w:t xml:space="preserve">Select the </w:t>
+      </w:r>
+      <w:r>
+        <w:rPr>
+          <w:b/>
+          <w:bCs/>
+          <w:u w:val="single"/>
+        </w:rPr>
+        <w:t>More info</w:t>
+      </w:r>
+      <w:r>
+        <w:t xml:space="preserve"> link. The App: will be named </w:t>
+      </w:r>
+      <w:r>
+        <w:rPr>
+          <w:b/>
+          <w:bCs/>
+        </w:rPr>
+        <w:t>OrchidAppSetup-….exe</w:t>
+      </w:r>
+      <w:r>
+        <w:t xml:space="preserve"> and it will be Unknown publisher. Select the </w:t>
+      </w:r>
+      <w:r>
+        <w:rPr>
+          <w:b/>
+          <w:bCs/>
+        </w:rPr>
+        <w:t>Run anyway</w:t>
+      </w:r>
+      <w:r>
+        <w:t xml:space="preserve"> button.</w:t>
+      </w:r>
+    </w:p>
+    <w:p>
+      <w:r>
+        <w:rPr>
+          <w:noProof/>
+        </w:rPr>
+        <w:lastRenderedPageBreak/>
+        <w:drawing>
+          <wp:inline distT="0" distB="0" distL="0" distR="0" wp14:anchorId="130EF8BD" wp14:editId="617CBAF4">
+            <wp:extent cx="3086100" cy="2853813"/>
+            <wp:effectExtent l="0" t="0" r="0" b="3810"/>
+            <wp:docPr id="1285984301" name="Picture 1"/>
+            <wp:cNvGraphicFramePr>
+              <a:graphicFrameLocks xmlns:a="http://schemas.openxmlformats.org/drawingml/2006/main" noChangeAspect="1"/>
+            </wp:cNvGraphicFramePr>
+            <a:graphic xmlns:a="http://schemas.openxmlformats.org/drawingml/2006/main">
+              <a:graphicData uri="http://schemas.openxmlformats.org/drawingml/2006/picture">
+                <pic:pic xmlns:pic="http://schemas.openxmlformats.org/drawingml/2006/picture">
+                  <pic:nvPicPr>
+                    <pic:cNvPr id="1285984301" name="Picture 1285984301"/>
+                    <pic:cNvPicPr/>
+                  </pic:nvPicPr>
+                  <pic:blipFill>
+                    <a:blip r:embed="rId12"/>
+                    <a:stretch>
+                      <a:fillRect/>
+                    </a:stretch>
+                  </pic:blipFill>
+                  <pic:spPr>
+                    <a:xfrm>
+                      <a:off x="0" y="0"/>
+                      <a:ext cx="3088676" cy="2856195"/>
+                    </a:xfrm>
+                    <a:prstGeom prst="rect">
+                      <a:avLst/>
+                    </a:prstGeom>
+                  </pic:spPr>
+                </pic:pic>
+              </a:graphicData>
+            </a:graphic>
+          </wp:inline>
+        </w:drawing>
+      </w:r>
+      <w:r>
+        <w:tab/>
+      </w:r>
+      <w:r>
+        <w:rPr>
+          <w:noProof/>
+        </w:rPr>
+        <w:drawing>
+          <wp:inline distT="0" distB="0" distL="0" distR="0" wp14:anchorId="184FDA05" wp14:editId="1BC5CD2E">
+            <wp:extent cx="3000375" cy="2848632"/>
+            <wp:effectExtent l="0" t="0" r="0" b="8890"/>
+            <wp:docPr id="1221703675" name="Picture 2"/>
+            <wp:cNvGraphicFramePr>
+              <a:graphicFrameLocks xmlns:a="http://schemas.openxmlformats.org/drawingml/2006/main" noChangeAspect="1"/>
+            </wp:cNvGraphicFramePr>
+            <a:graphic xmlns:a="http://schemas.openxmlformats.org/drawingml/2006/main">
+              <a:graphicData uri="http://schemas.openxmlformats.org/drawingml/2006/picture">
+                <pic:pic xmlns:pic="http://schemas.openxmlformats.org/drawingml/2006/picture">
+                  <pic:nvPicPr>
+                    <pic:cNvPr id="1221703675" name="Picture 1221703675"/>
+                    <pic:cNvPicPr/>
+                  </pic:nvPicPr>
+                  <pic:blipFill>
+                    <a:blip r:embed="rId13"/>
+                    <a:stretch>
+                      <a:fillRect/>
+                    </a:stretch>
+                  </pic:blipFill>
+                  <pic:spPr>
+                    <a:xfrm>
+                      <a:off x="0" y="0"/>
+                      <a:ext cx="3029454" cy="2876240"/>
+                    </a:xfrm>
+                    <a:prstGeom prst="rect">
+                      <a:avLst/>
+                    </a:prstGeom>
+                  </pic:spPr>
+                </pic:pic>
+              </a:graphicData>
+            </a:graphic>
+          </wp:inline>
+        </w:drawing>
+      </w:r>
+    </w:p>
+    <w:p>
+      <w:pPr>
         <w:pStyle w:val="Heading1"/>
       </w:pPr>
       <w:r>
-        <w:rPr>
-          <w:color w:val="000000"/>
-          <w:u w:val="none"/>
-        </w:rPr>
         <w:t xml:space="preserve">5. Follow the </w:t>
       </w:r>
       <w:proofErr w:type="spellStart"/>
       <w:r>
-        <w:rPr>
-          <w:color w:val="000000"/>
-          <w:u w:val="none"/>
-        </w:rPr>
         <w:t>OrchidApp</w:t>
       </w:r>
       <w:proofErr w:type="spellEnd"/>
       <w:r>
-        <w:rPr>
-          <w:color w:val="000000"/>
-          <w:u w:val="none"/>
-        </w:rPr>
         <w:t xml:space="preserve"> Setup Wizard</w:t>
       </w:r>
     </w:p>
@@ -1046,7 +1119,7 @@
                     <pic:cNvPicPr/>
                   </pic:nvPicPr>
                   <pic:blipFill>
-                    <a:blip r:embed="rId12"/>
+                    <a:blip r:embed="rId14"/>
                     <a:stretch>
                       <a:fillRect/>
                     </a:stretch>
@@ -1072,10 +1145,6 @@
         <w:pStyle w:val="Heading1"/>
       </w:pPr>
       <w:r>
-        <w:rPr>
-          <w:color w:val="000000"/>
-          <w:u w:val="none"/>
-        </w:rPr>
         <w:t>6. Choose shortcut options</w:t>
       </w:r>
     </w:p>
@@ -1152,7 +1221,7 @@
                     <pic:cNvPicPr/>
                   </pic:nvPicPr>
                   <pic:blipFill>
-                    <a:blip r:embed="rId13"/>
+                    <a:blip r:embed="rId15"/>
                     <a:stretch>
                       <a:fillRect/>
                     </a:stretch>
@@ -1178,18 +1247,10 @@
         <w:pStyle w:val="Heading1"/>
       </w:pPr>
       <w:r>
-        <w:rPr>
-          <w:color w:val="000000"/>
-          <w:u w:val="none"/>
-        </w:rPr>
         <w:t xml:space="preserve">7. Install or upgrade </w:t>
       </w:r>
       <w:proofErr w:type="spellStart"/>
       <w:r>
-        <w:rPr>
-          <w:color w:val="000000"/>
-          <w:u w:val="none"/>
-        </w:rPr>
         <w:t>OrchidApp</w:t>
       </w:r>
       <w:proofErr w:type="spellEnd"/>
@@ -1233,7 +1294,7 @@
                     <pic:cNvPicPr/>
                   </pic:nvPicPr>
                   <pic:blipFill>
-                    <a:blip r:embed="rId14"/>
+                    <a:blip r:embed="rId16"/>
                     <a:stretch>
                       <a:fillRect/>
                     </a:stretch>
@@ -1269,15 +1330,7 @@
     </w:p>
     <w:p>
       <w:r>
-        <w:t xml:space="preserve">For a new install, this </w:t>
-      </w:r>
-      <w:proofErr w:type="gramStart"/>
-      <w:r>
-        <w:t>installs</w:t>
-      </w:r>
-      <w:proofErr w:type="gramEnd"/>
-      <w:r>
-        <w:t xml:space="preserve"> </w:t>
+        <w:t xml:space="preserve">For a new install, this installs </w:t>
       </w:r>
       <w:proofErr w:type="spellStart"/>
       <w:r>
@@ -1326,7 +1379,7 @@
                     <pic:cNvPicPr/>
                   </pic:nvPicPr>
                   <pic:blipFill>
-                    <a:blip r:embed="rId15"/>
+                    <a:blip r:embed="rId17"/>
                     <a:stretch>
                       <a:fillRect/>
                     </a:stretch>
@@ -1352,10 +1405,6 @@
         <w:pStyle w:val="Heading1"/>
       </w:pPr>
       <w:r>
-        <w:rPr>
-          <w:color w:val="000000"/>
-          <w:u w:val="none"/>
-        </w:rPr>
         <w:t>8. Finish setup</w:t>
       </w:r>
     </w:p>
@@ -1420,7 +1469,7 @@
                     <pic:cNvPicPr/>
                   </pic:nvPicPr>
                   <pic:blipFill>
-                    <a:blip r:embed="rId16"/>
+                    <a:blip r:embed="rId18"/>
                     <a:stretch>
                       <a:fillRect/>
                     </a:stretch>
@@ -1446,19 +1495,11 @@
         <w:pStyle w:val="Heading1"/>
       </w:pPr>
       <w:r>
-        <w:rPr>
-          <w:color w:val="000000"/>
-          <w:u w:val="none"/>
-        </w:rPr>
         <w:lastRenderedPageBreak/>
         <w:t xml:space="preserve">9. Open </w:t>
       </w:r>
       <w:proofErr w:type="spellStart"/>
       <w:r>
-        <w:rPr>
-          <w:color w:val="000000"/>
-          <w:u w:val="none"/>
-        </w:rPr>
         <w:t>OrchidApp</w:t>
       </w:r>
       <w:proofErr w:type="spellEnd"/>
@@ -1493,10 +1534,6 @@
       <w:r>
         <w:t>On first use, the launcher prepares the database and checks photo storage and image processing before opening the app. Keep any reported recovery files and contact support if these checks fail.</w:t>
       </w:r>
-      <w:proofErr w:type="spellStart"/>
-      <w:r/>
-      <w:proofErr w:type="spellEnd"/>
-      <w:r/>
     </w:p>
     <w:p>
       <w:r>
@@ -1585,7 +1622,7 @@
                     <pic:cNvPicPr/>
                   </pic:nvPicPr>
                   <pic:blipFill>
-                    <a:blip r:embed="rId17"/>
+                    <a:blip r:embed="rId19"/>
                     <a:stretch>
                       <a:fillRect/>
                     </a:stretch>
@@ -1611,26 +1648,14 @@
         <w:pStyle w:val="Heading1"/>
       </w:pPr>
       <w:r>
-        <w:rPr>
-          <w:color w:val="000000"/>
-          <w:u w:val="none"/>
-        </w:rPr>
         <w:t xml:space="preserve">10. Check </w:t>
       </w:r>
       <w:proofErr w:type="spellStart"/>
       <w:r>
-        <w:rPr>
-          <w:color w:val="000000"/>
-          <w:u w:val="none"/>
-        </w:rPr>
         <w:t>OrchidApp</w:t>
       </w:r>
       <w:proofErr w:type="spellEnd"/>
       <w:r>
-        <w:rPr>
-          <w:color w:val="000000"/>
-          <w:u w:val="none"/>
-        </w:rPr>
         <w:t xml:space="preserve"> opens correctly</w:t>
       </w:r>
     </w:p>
@@ -1704,7 +1729,7 @@
                     <pic:cNvPicPr/>
                   </pic:nvPicPr>
                   <pic:blipFill>
-                    <a:blip r:embed="rId18"/>
+                    <a:blip r:embed="rId20"/>
                     <a:stretch>
                       <a:fillRect/>
                     </a:stretch>
@@ -1731,17 +1756,9 @@
         <w:pStyle w:val="Heading1"/>
       </w:pPr>
       <w:r>
-        <w:rPr>
-          <w:color w:val="000000"/>
-          <w:u w:val="none"/>
-        </w:rPr>
         <w:t xml:space="preserve">11. </w:t>
       </w:r>
       <w:r>
-        <w:rPr>
-          <w:color w:val="000000"/>
-          <w:u w:val="none"/>
-        </w:rPr>
         <w:t>Installation or upgrade complete</w:t>
       </w:r>
     </w:p>
@@ -1839,10 +1856,6 @@
         <w:pStyle w:val="Heading1"/>
       </w:pPr>
       <w:r>
-        <w:rPr>
-          <w:color w:val="000000"/>
-          <w:u w:val="none"/>
-        </w:rPr>
         <w:t>After installing or upgrading</w:t>
       </w:r>
     </w:p>
@@ -1969,10 +1982,6 @@
         <w:pStyle w:val="Heading1"/>
       </w:pPr>
       <w:r>
-        <w:rPr>
-          <w:color w:val="000000"/>
-          <w:u w:val="none"/>
-        </w:rPr>
         <w:t>First-use performance note</w:t>
       </w:r>
     </w:p>
@@ -2035,10 +2044,6 @@
         <w:pStyle w:val="Heading1"/>
       </w:pPr>
       <w:r>
-        <w:rPr>
-          <w:color w:val="000000"/>
-          <w:u w:val="none"/>
-        </w:rPr>
         <w:t>Important upgrade notes</w:t>
       </w:r>
     </w:p>
@@ -2144,18 +2149,10 @@
         <w:pStyle w:val="Heading1"/>
       </w:pPr>
       <w:r>
-        <w:rPr>
-          <w:color w:val="000000"/>
-          <w:u w:val="none"/>
-        </w:rPr>
         <w:t xml:space="preserve">Uninstalling </w:t>
       </w:r>
       <w:proofErr w:type="spellStart"/>
       <w:r>
-        <w:rPr>
-          <w:color w:val="000000"/>
-          <w:u w:val="none"/>
-        </w:rPr>
         <w:t>OrchidApp</w:t>
       </w:r>
       <w:proofErr w:type="spellEnd"/>
@@ -2296,10 +2293,6 @@
         <w:pStyle w:val="Heading1"/>
       </w:pPr>
       <w:r>
-        <w:rPr>
-          <w:color w:val="000000"/>
-          <w:u w:val="none"/>
-        </w:rPr>
         <w:t>Getting support</w:t>
       </w:r>
     </w:p>
@@ -2333,13 +2326,8 @@
       <w:pPr>
         <w:pStyle w:val="ListBullet"/>
       </w:pPr>
-      <w:proofErr w:type="gramStart"/>
-      <w:r>
-        <w:t>what</w:t>
-      </w:r>
-      <w:proofErr w:type="gramEnd"/>
-      <w:r>
-        <w:t xml:space="preserve"> you were trying to do</w:t>
+      <w:r>
+        <w:t>what you were trying to do</w:t>
       </w:r>
     </w:p>
     <w:p>
@@ -2363,6 +2351,7 @@
         <w:pStyle w:val="ListBullet"/>
       </w:pPr>
       <w:r>
+        <w:lastRenderedPageBreak/>
         <w:t xml:space="preserve">any message shown by the </w:t>
       </w:r>
       <w:proofErr w:type="spellStart"/>
@@ -2384,7 +2373,6 @@
     </w:p>
     <w:p>
       <w:r>
-        <w:lastRenderedPageBreak/>
         <w:t>The launcher support log is stored at:</w:t>
       </w:r>
     </w:p>
@@ -2402,10 +2390,6 @@
         <w:pStyle w:val="Heading1"/>
       </w:pPr>
       <w:r>
-        <w:rPr>
-          <w:color w:val="000000"/>
-          <w:u w:val="none"/>
-        </w:rPr>
         <w:t>Troubleshooting</w:t>
       </w:r>
     </w:p>
@@ -2522,19 +2506,11 @@
             <w:r>
               <w:t xml:space="preserve">, then </w:t>
             </w:r>
-            <w:proofErr w:type="gramStart"/>
             <w:r>
               <w:rPr>
                 <w:b/>
               </w:rPr>
-              <w:t>Run</w:t>
-            </w:r>
-            <w:proofErr w:type="gramEnd"/>
-            <w:r>
-              <w:rPr>
-                <w:b/>
-              </w:rPr>
-              <w:t xml:space="preserve"> anyway</w:t>
+              <w:t>Run anyway</w:t>
             </w:r>
             <w:r>
               <w:t>, only if you trust the installer.</w:t>
@@ -2822,12 +2798,12 @@
     </w:tbl>
     <w:p/>
     <w:sectPr>
-      <w:headerReference w:type="even" r:id="rId19"/>
-      <w:headerReference w:type="default" r:id="rId20"/>
-      <w:footerReference w:type="even" r:id="rId21"/>
-      <w:footerReference w:type="default" r:id="rId22"/>
-      <w:headerReference w:type="first" r:id="rId23"/>
-      <w:footerReference w:type="first" r:id="rId24"/>
+      <w:headerReference w:type="even" r:id="rId21"/>
+      <w:headerReference w:type="default" r:id="rId22"/>
+      <w:footerReference w:type="even" r:id="rId23"/>
+      <w:footerReference w:type="default" r:id="rId24"/>
+      <w:headerReference w:type="first" r:id="rId25"/>
+      <w:footerReference w:type="first" r:id="rId26"/>
       <w:pgSz w:w="12240" w:h="15840"/>
       <w:pgMar w:top="936" w:right="1008" w:bottom="936" w:left="1008" w:header="720" w:footer="720" w:gutter="0"/>
       <w:cols w:space="720"/>
@@ -3628,7 +3604,7 @@
   <w:style w:type="paragraph" w:default="1" w:styleId="Normal">
     <w:name w:val="Normal"/>
     <w:qFormat/>
-    <w:rsid w:val="00FC693F"/>
+    <w:rsid w:val="00517174"/>
     <w:pPr>
       <w:spacing w:after="120" w:line="259" w:lineRule="auto"/>
     </w:pPr>

</xml_diff>